<commit_message>
Binder sources: remove assurance/verification/certification claims; add Appendix A-1 expenditure record
- Rewrite claim wording in binder_source_ordered and assembled DOCX at the XML run level (formatting preserved); rename 5 sources
- Add 'Nature of this binder' notice and endpoint wording
- Add A-1 AI Governance Expenditure Record (DOCX, XLSX, CSV) and append to assembled binders
- Add idempotent scripts/binder tooling and binder-source tests
</commit_message>
<xml_diff>
--- a/Paladin_Compliance_1.10_Governance_Escalation_Concepts.docx
+++ b/Paladin_Compliance_1.10_Governance_Escalation_Concepts.docx
@@ -633,7 +633,7 @@
                 <w:color w:val="2F3A4A"/>
                 <w:sz w:val="16"/>
               </w:rPr>
-              <w:t>A vendor attestation is delayed while customer assurance language still implies full coverage.</w:t>
+              <w:t>A vendor attestation is delayed while customer confidence language still implies full coverage.</w:t>
             </w:r>
           </w:p>
         </w:tc>
@@ -4753,7 +4753,7 @@
                 <w:color w:val="2F3A4A"/>
                 <w:sz w:val="16"/>
               </w:rPr>
-              <w:t>Customer assurance owner plus evidence owner plus commercial approver.</w:t>
+              <w:t>Customer confidence owner plus evidence owner plus commercial approver.</w:t>
             </w:r>
           </w:p>
         </w:tc>
@@ -7520,7 +7520,7 @@
                 <w:color w:val="2F3A4A"/>
                 <w:sz w:val="16"/>
               </w:rPr>
-              <w:t>Route to obligation owner, customer assurance authority, and executive sponsor if customer position may change.</w:t>
+              <w:t>Route to obligation owner, customer confidence authority, and executive sponsor if customer position may change.</w:t>
             </w:r>
           </w:p>
         </w:tc>
@@ -9682,7 +9682,7 @@
                 <w:color w:val="2F3A4A"/>
                 <w:sz w:val="16"/>
               </w:rPr>
-              <w:t>AI drafts assurance or incident language before evidence sufficiency is confirmed.</w:t>
+              <w:t>AI drafts confidence or incident language before evidence sufficiency is confirmed.</w:t>
             </w:r>
           </w:p>
         </w:tc>

</xml_diff>